<commit_message>
docs: remove 4-hour timebox framing from project documentation
</commit_message>
<xml_diff>
--- a/docs/01_Project_Plan_Retail_Sales_Forecasting.docx
+++ b/docs/01_Project_Plan_Retail_Sales_Forecasting.docx
@@ -73,7 +73,7 @@
           <w:rFonts w:ascii="Times New Roman" w:hAnsi="Times New Roman" w:cs="Times New Roman"/>
           <w:color w:val="595959"/>
         </w:rPr>
-        <w:t>Audience: Regional Sales Team  |  Timebox: 4 Hours  |  Tooling: Power BI Desktop</w:t>
+        <w:t>Audience: Regional Sales Team  |  Tooling: Power BI Desktop</w:t>
       </w:r>
     </w:p>
     <w:p>
@@ -160,17 +160,7 @@
               <w:rFonts w:ascii="Times New Roman" w:hAnsi="Times New Roman" w:cs="Times New Roman"/>
             </w:rPr>
             <w:fldChar w:fldCharType="begin"/>
-          </w:r>
-          <w:r>
-            <w:rPr>
-              <w:rFonts w:ascii="Times New Roman" w:hAnsi="Times New Roman" w:cs="Times New Roman"/>
-            </w:rPr>
             <w:instrText>TOC \h \o "1-2"</w:instrText>
-          </w:r>
-          <w:r>
-            <w:rPr>
-              <w:rFonts w:ascii="Times New Roman" w:hAnsi="Times New Roman" w:cs="Times New Roman"/>
-            </w:rPr>
             <w:fldChar w:fldCharType="separate"/>
           </w:r>
           <w:hyperlink w:anchor="_Toc236316913" w:history="1">
@@ -189,40 +179,10 @@
                 <w:noProof/>
               </w:rPr>
               <w:tab/>
-            </w:r>
-            <w:r>
-              <w:rPr>
-                <w:noProof/>
-              </w:rPr>
               <w:fldChar w:fldCharType="begin"/>
-            </w:r>
-            <w:r>
-              <w:rPr>
-                <w:noProof/>
-              </w:rPr>
               <w:instrText xml:space="preserve"> PAGEREF _Toc236316913 \h </w:instrText>
-            </w:r>
-            <w:r>
-              <w:rPr>
-                <w:noProof/>
-              </w:rPr>
-            </w:r>
-            <w:r>
-              <w:rPr>
-                <w:noProof/>
-              </w:rPr>
               <w:fldChar w:fldCharType="separate"/>
-            </w:r>
-            <w:r>
-              <w:rPr>
-                <w:noProof/>
-              </w:rPr>
               <w:t>2</w:t>
-            </w:r>
-            <w:r>
-              <w:rPr>
-                <w:noProof/>
-              </w:rPr>
               <w:fldChar w:fldCharType="end"/>
             </w:r>
           </w:hyperlink>
@@ -258,40 +218,10 @@
                 <w:noProof/>
               </w:rPr>
               <w:tab/>
-            </w:r>
-            <w:r>
-              <w:rPr>
-                <w:noProof/>
-              </w:rPr>
               <w:fldChar w:fldCharType="begin"/>
-            </w:r>
-            <w:r>
-              <w:rPr>
-                <w:noProof/>
-              </w:rPr>
               <w:instrText xml:space="preserve"> PAGEREF _Toc236316914 \h </w:instrText>
-            </w:r>
-            <w:r>
-              <w:rPr>
-                <w:noProof/>
-              </w:rPr>
-            </w:r>
-            <w:r>
-              <w:rPr>
-                <w:noProof/>
-              </w:rPr>
               <w:fldChar w:fldCharType="separate"/>
-            </w:r>
-            <w:r>
-              <w:rPr>
-                <w:noProof/>
-              </w:rPr>
               <w:t>3</w:t>
-            </w:r>
-            <w:r>
-              <w:rPr>
-                <w:noProof/>
-              </w:rPr>
               <w:fldChar w:fldCharType="end"/>
             </w:r>
           </w:hyperlink>
@@ -327,40 +257,10 @@
                 <w:noProof/>
               </w:rPr>
               <w:tab/>
-            </w:r>
-            <w:r>
-              <w:rPr>
-                <w:noProof/>
-              </w:rPr>
               <w:fldChar w:fldCharType="begin"/>
-            </w:r>
-            <w:r>
-              <w:rPr>
-                <w:noProof/>
-              </w:rPr>
               <w:instrText xml:space="preserve"> PAGEREF _Toc236316915 \h </w:instrText>
-            </w:r>
-            <w:r>
-              <w:rPr>
-                <w:noProof/>
-              </w:rPr>
-            </w:r>
-            <w:r>
-              <w:rPr>
-                <w:noProof/>
-              </w:rPr>
               <w:fldChar w:fldCharType="separate"/>
-            </w:r>
-            <w:r>
-              <w:rPr>
-                <w:noProof/>
-              </w:rPr>
               <w:t>3</w:t>
-            </w:r>
-            <w:r>
-              <w:rPr>
-                <w:noProof/>
-              </w:rPr>
               <w:fldChar w:fldCharType="end"/>
             </w:r>
           </w:hyperlink>
@@ -396,40 +296,10 @@
                 <w:noProof/>
               </w:rPr>
               <w:tab/>
-            </w:r>
-            <w:r>
-              <w:rPr>
-                <w:noProof/>
-              </w:rPr>
               <w:fldChar w:fldCharType="begin"/>
-            </w:r>
-            <w:r>
-              <w:rPr>
-                <w:noProof/>
-              </w:rPr>
               <w:instrText xml:space="preserve"> PAGEREF _Toc236316916 \h </w:instrText>
-            </w:r>
-            <w:r>
-              <w:rPr>
-                <w:noProof/>
-              </w:rPr>
-            </w:r>
-            <w:r>
-              <w:rPr>
-                <w:noProof/>
-              </w:rPr>
               <w:fldChar w:fldCharType="separate"/>
-            </w:r>
-            <w:r>
-              <w:rPr>
-                <w:noProof/>
-              </w:rPr>
               <w:t>4</w:t>
-            </w:r>
-            <w:r>
-              <w:rPr>
-                <w:noProof/>
-              </w:rPr>
               <w:fldChar w:fldCharType="end"/>
             </w:r>
           </w:hyperlink>
@@ -465,40 +335,10 @@
                 <w:noProof/>
               </w:rPr>
               <w:tab/>
-            </w:r>
-            <w:r>
-              <w:rPr>
-                <w:noProof/>
-              </w:rPr>
               <w:fldChar w:fldCharType="begin"/>
-            </w:r>
-            <w:r>
-              <w:rPr>
-                <w:noProof/>
-              </w:rPr>
               <w:instrText xml:space="preserve"> PAGEREF _Toc236316917 \h </w:instrText>
-            </w:r>
-            <w:r>
-              <w:rPr>
-                <w:noProof/>
-              </w:rPr>
-            </w:r>
-            <w:r>
-              <w:rPr>
-                <w:noProof/>
-              </w:rPr>
               <w:fldChar w:fldCharType="separate"/>
-            </w:r>
-            <w:r>
-              <w:rPr>
-                <w:noProof/>
-              </w:rPr>
               <w:t>4</w:t>
-            </w:r>
-            <w:r>
-              <w:rPr>
-                <w:noProof/>
-              </w:rPr>
               <w:fldChar w:fldCharType="end"/>
             </w:r>
           </w:hyperlink>
@@ -534,40 +374,10 @@
                 <w:noProof/>
               </w:rPr>
               <w:tab/>
-            </w:r>
-            <w:r>
-              <w:rPr>
-                <w:noProof/>
-              </w:rPr>
               <w:fldChar w:fldCharType="begin"/>
-            </w:r>
-            <w:r>
-              <w:rPr>
-                <w:noProof/>
-              </w:rPr>
               <w:instrText xml:space="preserve"> PAGEREF _Toc236316918 \h </w:instrText>
-            </w:r>
-            <w:r>
-              <w:rPr>
-                <w:noProof/>
-              </w:rPr>
-            </w:r>
-            <w:r>
-              <w:rPr>
-                <w:noProof/>
-              </w:rPr>
               <w:fldChar w:fldCharType="separate"/>
-            </w:r>
-            <w:r>
-              <w:rPr>
-                <w:noProof/>
-              </w:rPr>
               <w:t>4</w:t>
-            </w:r>
-            <w:r>
-              <w:rPr>
-                <w:noProof/>
-              </w:rPr>
               <w:fldChar w:fldCharType="end"/>
             </w:r>
           </w:hyperlink>
@@ -603,40 +413,10 @@
                 <w:noProof/>
               </w:rPr>
               <w:tab/>
-            </w:r>
-            <w:r>
-              <w:rPr>
-                <w:noProof/>
-              </w:rPr>
               <w:fldChar w:fldCharType="begin"/>
-            </w:r>
-            <w:r>
-              <w:rPr>
-                <w:noProof/>
-              </w:rPr>
               <w:instrText xml:space="preserve"> PAGEREF _Toc236316919 \h </w:instrText>
-            </w:r>
-            <w:r>
-              <w:rPr>
-                <w:noProof/>
-              </w:rPr>
-            </w:r>
-            <w:r>
-              <w:rPr>
-                <w:noProof/>
-              </w:rPr>
               <w:fldChar w:fldCharType="separate"/>
-            </w:r>
-            <w:r>
-              <w:rPr>
-                <w:noProof/>
-              </w:rPr>
               <w:t>5</w:t>
-            </w:r>
-            <w:r>
-              <w:rPr>
-                <w:noProof/>
-              </w:rPr>
               <w:fldChar w:fldCharType="end"/>
             </w:r>
           </w:hyperlink>
@@ -672,40 +452,10 @@
                 <w:noProof/>
               </w:rPr>
               <w:tab/>
-            </w:r>
-            <w:r>
-              <w:rPr>
-                <w:noProof/>
-              </w:rPr>
               <w:fldChar w:fldCharType="begin"/>
-            </w:r>
-            <w:r>
-              <w:rPr>
-                <w:noProof/>
-              </w:rPr>
               <w:instrText xml:space="preserve"> PAGEREF _Toc236316920 \h </w:instrText>
-            </w:r>
-            <w:r>
-              <w:rPr>
-                <w:noProof/>
-              </w:rPr>
-            </w:r>
-            <w:r>
-              <w:rPr>
-                <w:noProof/>
-              </w:rPr>
               <w:fldChar w:fldCharType="separate"/>
-            </w:r>
-            <w:r>
-              <w:rPr>
-                <w:noProof/>
-              </w:rPr>
               <w:t>5</w:t>
-            </w:r>
-            <w:r>
-              <w:rPr>
-                <w:noProof/>
-              </w:rPr>
               <w:fldChar w:fldCharType="end"/>
             </w:r>
           </w:hyperlink>
@@ -741,40 +491,10 @@
                 <w:noProof/>
               </w:rPr>
               <w:tab/>
-            </w:r>
-            <w:r>
-              <w:rPr>
-                <w:noProof/>
-              </w:rPr>
               <w:fldChar w:fldCharType="begin"/>
-            </w:r>
-            <w:r>
-              <w:rPr>
-                <w:noProof/>
-              </w:rPr>
               <w:instrText xml:space="preserve"> PAGEREF _Toc236316921 \h </w:instrText>
-            </w:r>
-            <w:r>
-              <w:rPr>
-                <w:noProof/>
-              </w:rPr>
-            </w:r>
-            <w:r>
-              <w:rPr>
-                <w:noProof/>
-              </w:rPr>
               <w:fldChar w:fldCharType="separate"/>
-            </w:r>
-            <w:r>
-              <w:rPr>
-                <w:noProof/>
-              </w:rPr>
               <w:t>6</w:t>
-            </w:r>
-            <w:r>
-              <w:rPr>
-                <w:noProof/>
-              </w:rPr>
               <w:fldChar w:fldCharType="end"/>
             </w:r>
           </w:hyperlink>
@@ -810,40 +530,10 @@
                 <w:noProof/>
               </w:rPr>
               <w:tab/>
-            </w:r>
-            <w:r>
-              <w:rPr>
-                <w:noProof/>
-              </w:rPr>
               <w:fldChar w:fldCharType="begin"/>
-            </w:r>
-            <w:r>
-              <w:rPr>
-                <w:noProof/>
-              </w:rPr>
               <w:instrText xml:space="preserve"> PAGEREF _Toc236316922 \h </w:instrText>
-            </w:r>
-            <w:r>
-              <w:rPr>
-                <w:noProof/>
-              </w:rPr>
-            </w:r>
-            <w:r>
-              <w:rPr>
-                <w:noProof/>
-              </w:rPr>
               <w:fldChar w:fldCharType="separate"/>
-            </w:r>
-            <w:r>
-              <w:rPr>
-                <w:noProof/>
-              </w:rPr>
               <w:t>7</w:t>
-            </w:r>
-            <w:r>
-              <w:rPr>
-                <w:noProof/>
-              </w:rPr>
               <w:fldChar w:fldCharType="end"/>
             </w:r>
           </w:hyperlink>
@@ -879,40 +569,10 @@
                 <w:noProof/>
               </w:rPr>
               <w:tab/>
-            </w:r>
-            <w:r>
-              <w:rPr>
-                <w:noProof/>
-              </w:rPr>
               <w:fldChar w:fldCharType="begin"/>
-            </w:r>
-            <w:r>
-              <w:rPr>
-                <w:noProof/>
-              </w:rPr>
               <w:instrText xml:space="preserve"> PAGEREF _Toc236316923 \h </w:instrText>
-            </w:r>
-            <w:r>
-              <w:rPr>
-                <w:noProof/>
-              </w:rPr>
-            </w:r>
-            <w:r>
-              <w:rPr>
-                <w:noProof/>
-              </w:rPr>
               <w:fldChar w:fldCharType="separate"/>
-            </w:r>
-            <w:r>
-              <w:rPr>
-                <w:noProof/>
-              </w:rPr>
               <w:t>8</w:t>
-            </w:r>
-            <w:r>
-              <w:rPr>
-                <w:noProof/>
-              </w:rPr>
               <w:fldChar w:fldCharType="end"/>
             </w:r>
           </w:hyperlink>
@@ -948,40 +608,10 @@
                 <w:noProof/>
               </w:rPr>
               <w:tab/>
-            </w:r>
-            <w:r>
-              <w:rPr>
-                <w:noProof/>
-              </w:rPr>
               <w:fldChar w:fldCharType="begin"/>
-            </w:r>
-            <w:r>
-              <w:rPr>
-                <w:noProof/>
-              </w:rPr>
               <w:instrText xml:space="preserve"> PAGEREF _Toc236316924 \h </w:instrText>
-            </w:r>
-            <w:r>
-              <w:rPr>
-                <w:noProof/>
-              </w:rPr>
-            </w:r>
-            <w:r>
-              <w:rPr>
-                <w:noProof/>
-              </w:rPr>
               <w:fldChar w:fldCharType="separate"/>
-            </w:r>
-            <w:r>
-              <w:rPr>
-                <w:noProof/>
-              </w:rPr>
               <w:t>9</w:t>
-            </w:r>
-            <w:r>
-              <w:rPr>
-                <w:noProof/>
-              </w:rPr>
               <w:fldChar w:fldCharType="end"/>
             </w:r>
           </w:hyperlink>
@@ -1017,40 +647,10 @@
                 <w:noProof/>
               </w:rPr>
               <w:tab/>
-            </w:r>
-            <w:r>
-              <w:rPr>
-                <w:noProof/>
-              </w:rPr>
               <w:fldChar w:fldCharType="begin"/>
-            </w:r>
-            <w:r>
-              <w:rPr>
-                <w:noProof/>
-              </w:rPr>
               <w:instrText xml:space="preserve"> PAGEREF _Toc236316925 \h </w:instrText>
-            </w:r>
-            <w:r>
-              <w:rPr>
-                <w:noProof/>
-              </w:rPr>
-            </w:r>
-            <w:r>
-              <w:rPr>
-                <w:noProof/>
-              </w:rPr>
               <w:fldChar w:fldCharType="separate"/>
-            </w:r>
-            <w:r>
-              <w:rPr>
-                <w:noProof/>
-              </w:rPr>
               <w:t>9</w:t>
-            </w:r>
-            <w:r>
-              <w:rPr>
-                <w:noProof/>
-              </w:rPr>
               <w:fldChar w:fldCharType="end"/>
             </w:r>
           </w:hyperlink>
@@ -1145,7 +745,7 @@
         <w:rPr>
           <w:rFonts w:ascii="Times New Roman" w:hAnsi="Times New Roman" w:cs="Times New Roman"/>
         </w:rPr>
-        <w:t>. It demonstrates end-to-end BI engineering discipline inside a deliberate four-hour timebox: a proper star-schema data model, a documented DAX measure layer (~35 measures), native time-series forecasting with confidence intervals, quota-attainment tracking against a self-generated quota table, and account-level action lists (top accounts, at-risk accounts, discount-vs-profit diagnostics).</w:t>
+        <w:t>. It demonstrates end-to-end BI engineering discipline: a proper star-schema data model, a documented DAX measure layer (~35 measures), native time-series forecasting with confidence intervals, quota-attainment tracking against a self-generated quota table, and account-level action lists (top accounts, at-risk accounts, discount-vs-profit diagnostics).</w:t>
       </w:r>
     </w:p>
     <w:p>
@@ -8356,7 +7956,7 @@
           <w:sz w:val="30"/>
           <w:szCs w:val="30"/>
         </w:rPr>
-        <w:t>6. Four-Hour Build Timeline</w:t>
+        <w:t>6. Build Sequence</w:t>
       </w:r>
     </w:p>
     <w:tbl>
@@ -8378,7 +7978,6 @@
       </w:tblPr>
       <w:tblGrid>
         <w:gridCol w:w="700"/>
-        <w:gridCol w:w="1400"/>
         <w:gridCol w:w="2200"/>
         <w:gridCol w:w="5500"/>
       </w:tblGrid>
@@ -8418,7 +8017,7 @@
         </w:tc>
         <w:tc>
           <w:tcPr>
-            <w:tcW w:w="1400" w:type="dxa"/>
+            <w:tcW w:w="2200" w:type="dxa"/>
             <w:shd w:val="clear" w:color="auto" w:fill="1F3864"/>
             <w:tcMar>
               <w:top w:w="60" w:type="dxa"/>
@@ -8442,13 +8041,13 @@
                 <w:sz w:val="18"/>
                 <w:szCs w:val="18"/>
               </w:rPr>
-              <w:t>Time</w:t>
-            </w:r>
-          </w:p>
-        </w:tc>
-        <w:tc>
-          <w:tcPr>
-            <w:tcW w:w="2200" w:type="dxa"/>
+              <w:t>Deliverable</w:t>
+            </w:r>
+          </w:p>
+        </w:tc>
+        <w:tc>
+          <w:tcPr>
+            <w:tcW w:w="5500" w:type="dxa"/>
             <w:shd w:val="clear" w:color="auto" w:fill="1F3864"/>
             <w:tcMar>
               <w:top w:w="60" w:type="dxa"/>
@@ -8472,36 +8071,6 @@
                 <w:sz w:val="18"/>
                 <w:szCs w:val="18"/>
               </w:rPr>
-              <w:t>Deliverable</w:t>
-            </w:r>
-          </w:p>
-        </w:tc>
-        <w:tc>
-          <w:tcPr>
-            <w:tcW w:w="5500" w:type="dxa"/>
-            <w:shd w:val="clear" w:color="auto" w:fill="1F3864"/>
-            <w:tcMar>
-              <w:top w:w="60" w:type="dxa"/>
-              <w:left w:w="100" w:type="dxa"/>
-              <w:bottom w:w="60" w:type="dxa"/>
-              <w:right w:w="100" w:type="dxa"/>
-            </w:tcMar>
-          </w:tcPr>
-          <w:p>
-            <w:pPr>
-              <w:rPr>
-                <w:rFonts w:ascii="Times New Roman" w:hAnsi="Times New Roman" w:cs="Times New Roman"/>
-              </w:rPr>
-            </w:pPr>
-            <w:r>
-              <w:rPr>
-                <w:rFonts w:ascii="Times New Roman" w:hAnsi="Times New Roman" w:cs="Times New Roman"/>
-                <w:b/>
-                <w:bCs/>
-                <w:color w:val="FFFFFF"/>
-                <w:sz w:val="18"/>
-                <w:szCs w:val="18"/>
-              </w:rPr>
               <w:t>Key tasks</w:t>
             </w:r>
           </w:p>
@@ -8537,33 +8106,6 @@
         </w:tc>
         <w:tc>
           <w:tcPr>
-            <w:tcW w:w="1400" w:type="dxa"/>
-            <w:tcMar>
-              <w:top w:w="60" w:type="dxa"/>
-              <w:left w:w="100" w:type="dxa"/>
-              <w:bottom w:w="60" w:type="dxa"/>
-              <w:right w:w="100" w:type="dxa"/>
-            </w:tcMar>
-          </w:tcPr>
-          <w:p>
-            <w:pPr>
-              <w:rPr>
-                <w:rFonts w:ascii="Times New Roman" w:hAnsi="Times New Roman" w:cs="Times New Roman"/>
-              </w:rPr>
-            </w:pPr>
-            <w:r>
-              <w:rPr>
-                <w:rFonts w:ascii="Times New Roman" w:hAnsi="Times New Roman" w:cs="Times New Roman"/>
-                <w:color w:val="000000"/>
-                <w:sz w:val="18"/>
-                <w:szCs w:val="18"/>
-              </w:rPr>
-              <w:t>0:00–1:00</w:t>
-            </w:r>
-          </w:p>
-        </w:tc>
-        <w:tc>
-          <w:tcPr>
             <w:tcW w:w="2200" w:type="dxa"/>
             <w:tcMar>
               <w:top w:w="60" w:type="dxa"/>
@@ -8647,33 +8189,6 @@
         </w:tc>
         <w:tc>
           <w:tcPr>
-            <w:tcW w:w="1400" w:type="dxa"/>
-            <w:tcMar>
-              <w:top w:w="60" w:type="dxa"/>
-              <w:left w:w="100" w:type="dxa"/>
-              <w:bottom w:w="60" w:type="dxa"/>
-              <w:right w:w="100" w:type="dxa"/>
-            </w:tcMar>
-          </w:tcPr>
-          <w:p>
-            <w:pPr>
-              <w:rPr>
-                <w:rFonts w:ascii="Times New Roman" w:hAnsi="Times New Roman" w:cs="Times New Roman"/>
-              </w:rPr>
-            </w:pPr>
-            <w:r>
-              <w:rPr>
-                <w:rFonts w:ascii="Times New Roman" w:hAnsi="Times New Roman" w:cs="Times New Roman"/>
-                <w:color w:val="000000"/>
-                <w:sz w:val="18"/>
-                <w:szCs w:val="18"/>
-              </w:rPr>
-              <w:t>1:00–2:00</w:t>
-            </w:r>
-          </w:p>
-        </w:tc>
-        <w:tc>
-          <w:tcPr>
             <w:tcW w:w="2200" w:type="dxa"/>
             <w:tcMar>
               <w:top w:w="60" w:type="dxa"/>
@@ -8757,33 +8272,6 @@
         </w:tc>
         <w:tc>
           <w:tcPr>
-            <w:tcW w:w="1400" w:type="dxa"/>
-            <w:tcMar>
-              <w:top w:w="60" w:type="dxa"/>
-              <w:left w:w="100" w:type="dxa"/>
-              <w:bottom w:w="60" w:type="dxa"/>
-              <w:right w:w="100" w:type="dxa"/>
-            </w:tcMar>
-          </w:tcPr>
-          <w:p>
-            <w:pPr>
-              <w:rPr>
-                <w:rFonts w:ascii="Times New Roman" w:hAnsi="Times New Roman" w:cs="Times New Roman"/>
-              </w:rPr>
-            </w:pPr>
-            <w:r>
-              <w:rPr>
-                <w:rFonts w:ascii="Times New Roman" w:hAnsi="Times New Roman" w:cs="Times New Roman"/>
-                <w:color w:val="000000"/>
-                <w:sz w:val="18"/>
-                <w:szCs w:val="18"/>
-              </w:rPr>
-              <w:t>2:00–3:00</w:t>
-            </w:r>
-          </w:p>
-        </w:tc>
-        <w:tc>
-          <w:tcPr>
             <w:tcW w:w="2200" w:type="dxa"/>
             <w:tcMar>
               <w:top w:w="60" w:type="dxa"/>
@@ -8867,33 +8355,6 @@
         </w:tc>
         <w:tc>
           <w:tcPr>
-            <w:tcW w:w="1400" w:type="dxa"/>
-            <w:tcMar>
-              <w:top w:w="60" w:type="dxa"/>
-              <w:left w:w="100" w:type="dxa"/>
-              <w:bottom w:w="60" w:type="dxa"/>
-              <w:right w:w="100" w:type="dxa"/>
-            </w:tcMar>
-          </w:tcPr>
-          <w:p>
-            <w:pPr>
-              <w:rPr>
-                <w:rFonts w:ascii="Times New Roman" w:hAnsi="Times New Roman" w:cs="Times New Roman"/>
-              </w:rPr>
-            </w:pPr>
-            <w:r>
-              <w:rPr>
-                <w:rFonts w:ascii="Times New Roman" w:hAnsi="Times New Roman" w:cs="Times New Roman"/>
-                <w:color w:val="000000"/>
-                <w:sz w:val="18"/>
-                <w:szCs w:val="18"/>
-              </w:rPr>
-              <w:t>3:00–4:00</w:t>
-            </w:r>
-          </w:p>
-        </w:tc>
-        <w:tc>
-          <w:tcPr>
             <w:tcW w:w="2200" w:type="dxa"/>
             <w:tcMar>
               <w:top w:w="60" w:type="dxa"/>
@@ -8942,27 +8403,7 @@
                 <w:sz w:val="18"/>
                 <w:szCs w:val="18"/>
               </w:rPr>
-              <w:t xml:space="preserve">Sync slicers; reset bookmark; </w:t>
-            </w:r>
-            <w:proofErr w:type="spellStart"/>
-            <w:r>
-              <w:rPr>
-                <w:rFonts w:ascii="Times New Roman" w:hAnsi="Times New Roman" w:cs="Times New Roman"/>
-                <w:color w:val="000000"/>
-                <w:sz w:val="18"/>
-                <w:szCs w:val="18"/>
-              </w:rPr>
-              <w:t>drillthrough</w:t>
-            </w:r>
-            <w:proofErr w:type="spellEnd"/>
-            <w:r>
-              <w:rPr>
-                <w:rFonts w:ascii="Times New Roman" w:hAnsi="Times New Roman" w:cs="Times New Roman"/>
-                <w:color w:val="000000"/>
-                <w:sz w:val="18"/>
-                <w:szCs w:val="18"/>
-              </w:rPr>
-              <w:t>; one tooltip page; README (§8); screenshots for GitHub/LinkedIn</w:t>
+              <w:t xml:space="preserve">Sync slicers; reset bookmark; drillthrough; one tooltip page; README (§8); screenshots for GitHub/LinkedIn</w:t>
             </w:r>
           </w:p>
         </w:tc>
@@ -8989,27 +8430,13 @@
           <w:b/>
           <w:bCs/>
         </w:rPr>
-        <w:t>Timebox guardrails:</w:t>
+        <w:t>Scope guardrails:</w:t>
       </w:r>
       <w:r>
         <w:rPr>
           <w:rFonts w:ascii="Times New Roman" w:hAnsi="Times New Roman" w:cs="Times New Roman"/>
         </w:rPr>
-        <w:t xml:space="preserve"> if Block 1 overruns, cut </w:t>
-      </w:r>
-      <w:proofErr w:type="spellStart"/>
-      <w:r>
-        <w:rPr>
-          <w:rFonts w:ascii="Times New Roman" w:hAnsi="Times New Roman" w:cs="Times New Roman"/>
-        </w:rPr>
-        <w:t>DimGeography</w:t>
-      </w:r>
-      <w:proofErr w:type="spellEnd"/>
-      <w:r>
-        <w:rPr>
-          <w:rFonts w:ascii="Times New Roman" w:hAnsi="Times New Roman" w:cs="Times New Roman"/>
-        </w:rPr>
-        <w:t xml:space="preserve"> to Region/State only. If Block 3 overruns, drop visual 3.4 (decomposition tree) first, then 2.2. Never cut the quota framework or the forecast — they are the differentiators.</w:t>
+        <w:t xml:space="preserve"> if Block 1 is at risk, cut DimGeography to Region/State only. If Block 3 is at risk, drop visual 3.4 (decomposition tree) first, then 2.2. Never cut the quota framework or the forecast — they are the differentiators.</w:t>
       </w:r>
     </w:p>
     <w:p>
@@ -9256,25 +8683,6 @@
           <w:rFonts w:ascii="Times New Roman" w:hAnsi="Times New Roman" w:cs="Times New Roman"/>
         </w:rPr>
         <w:t>Screenshots: one per page at 1280×720 plus one model-view screenshot showing the star schema — the model view is the credibility shot.</w:t>
-      </w:r>
-    </w:p>
-    <w:p>
-      <w:pPr>
-        <w:pStyle w:val="ListParagraph"/>
-        <w:numPr>
-          <w:ilvl w:val="0"/>
-          <w:numId w:val="2"/>
-        </w:numPr>
-        <w:spacing w:after="60"/>
-        <w:rPr>
-          <w:rFonts w:ascii="Times New Roman" w:hAnsi="Times New Roman" w:cs="Times New Roman"/>
-        </w:rPr>
-      </w:pPr>
-      <w:r>
-        <w:rPr>
-          <w:rFonts w:ascii="Times New Roman" w:hAnsi="Times New Roman" w:cs="Times New Roman"/>
-        </w:rPr>
-        <w:t>LinkedIn post angle: 'What a 4-hour timebox forces you to prioritize as a BI engineer' — scoping discipline is a senior signal that matches your consulting positioning.</w:t>
       </w:r>
     </w:p>
     <w:p>

</xml_diff>